<commit_message>
Scenarios moved to Part 2. Use of "assessment" and "management" harmonised. Front covers updated.
</commit_message>
<xml_diff>
--- a/Actions 2025-07-02.docx
+++ b/Actions 2025-07-02.docx
@@ -341,6 +341,32 @@
     </w:p>
     <w:p>
       <w:pPr>
+        <w:pStyle w:val="TextBody"/>
+        <w:widowControl/>
+        <w:bidi w:val="0"/>
+        <w:spacing w:before="0" w:after="0"/>
+        <w:rPr>
+          <w:highlight w:val="none"/>
+          <w:shd w:fill="FFA6A6" w:val="clear"/>
+        </w:rPr>
+      </w:pPr>
+      <w:r>
+        <w:rPr>
+          <w:rFonts w:ascii="Arial;Helvetica;sans-serif" w:hAnsi="Arial;Helvetica;sans-serif"/>
+          <w:b w:val="false"/>
+          <w:i w:val="false"/>
+          <w:caps w:val="false"/>
+          <w:smallCaps w:val="false"/>
+          <w:color w:val="222222"/>
+          <w:spacing w:val="0"/>
+          <w:sz w:val="24"/>
+          <w:shd w:fill="FFA6A6" w:val="clear"/>
+        </w:rPr>
+        <w:t>Move to part 2.</w:t>
+      </w:r>
+    </w:p>
+    <w:p>
+      <w:pPr>
         <w:pStyle w:val="Quotations"/>
         <w:widowControl/>
         <w:pBdr>
@@ -1151,7 +1177,7 @@
           <w:sz w:val="24"/>
           <w:shd w:fill="81D41A" w:val="clear"/>
         </w:rPr>
-        <w:t>Need to review use of terms “management” and “assessment” throughout.</w:t>
+        <w:t>Need to review use of terms “management” and “assessment” throughout. TR</w:t>
       </w:r>
     </w:p>
     <w:p>
@@ -2998,6 +3024,33 @@
         <w:pStyle w:val="TextBody"/>
         <w:widowControl/>
         <w:bidi w:val="0"/>
+        <w:spacing w:before="0" w:after="0"/>
+        <w:ind w:left="0" w:right="0" w:hanging="0"/>
+        <w:rPr>
+          <w:highlight w:val="none"/>
+          <w:shd w:fill="FFA6A6" w:val="clear"/>
+        </w:rPr>
+      </w:pPr>
+      <w:r>
+        <w:rPr>
+          <w:rFonts w:ascii="Arial;Helvetica;sans-serif" w:hAnsi="Arial;Helvetica;sans-serif"/>
+          <w:b w:val="false"/>
+          <w:i w:val="false"/>
+          <w:caps w:val="false"/>
+          <w:smallCaps w:val="false"/>
+          <w:color w:val="222222"/>
+          <w:spacing w:val="0"/>
+          <w:sz w:val="24"/>
+          <w:shd w:fill="FFA6A6" w:val="clear"/>
+        </w:rPr>
+        <w:t>Done</w:t>
+      </w:r>
+    </w:p>
+    <w:p>
+      <w:pPr>
+        <w:pStyle w:val="TextBody"/>
+        <w:widowControl/>
+        <w:bidi w:val="0"/>
         <w:ind w:left="0" w:right="0" w:hanging="0"/>
         <w:rPr/>
       </w:pPr>
@@ -3050,28 +3103,21 @@
         <w:spacing w:before="0" w:after="0"/>
         <w:ind w:left="0" w:right="0" w:hanging="0"/>
         <w:rPr>
-          <w:rFonts w:ascii="Arial;Helvetica;sans-serif" w:hAnsi="Arial;Helvetica;sans-serif"/>
-          <w:b w:val="false"/>
-          <w:b w:val="false"/>
-          <w:i w:val="false"/>
-          <w:i w:val="false"/>
-          <w:caps w:val="false"/>
-          <w:smallCaps w:val="false"/>
-          <w:color w:val="222222"/>
-          <w:spacing w:val="0"/>
-          <w:sz w:val="24"/>
-        </w:rPr>
-      </w:pPr>
-      <w:r>
-        <w:rPr>
-          <w:rFonts w:ascii="Arial;Helvetica;sans-serif" w:hAnsi="Arial;Helvetica;sans-serif"/>
-          <w:b w:val="false"/>
-          <w:i w:val="false"/>
-          <w:caps w:val="false"/>
-          <w:smallCaps w:val="false"/>
-          <w:color w:val="222222"/>
-          <w:spacing w:val="0"/>
-          <w:sz w:val="24"/>
+          <w:highlight w:val="none"/>
+          <w:shd w:fill="FFA6A6" w:val="clear"/>
+        </w:rPr>
+      </w:pPr>
+      <w:r>
+        <w:rPr>
+          <w:rFonts w:ascii="Arial;Helvetica;sans-serif" w:hAnsi="Arial;Helvetica;sans-serif"/>
+          <w:b w:val="false"/>
+          <w:i w:val="false"/>
+          <w:caps w:val="false"/>
+          <w:smallCaps w:val="false"/>
+          <w:color w:val="222222"/>
+          <w:spacing w:val="0"/>
+          <w:sz w:val="24"/>
+          <w:shd w:fill="FFA6A6" w:val="clear"/>
         </w:rPr>
         <w:t>Agreed. Done.</w:t>
       </w:r>
@@ -3577,6 +3623,114 @@
     </w:p>
     <w:p>
       <w:pPr>
+        <w:pStyle w:val="TextBody"/>
+        <w:widowControl/>
+        <w:bidi w:val="0"/>
+        <w:spacing w:before="0" w:after="0"/>
+        <w:ind w:left="0" w:right="0" w:hanging="0"/>
+        <w:jc w:val="left"/>
+        <w:rPr>
+          <w:rFonts w:ascii="Arial;Helvetica;sans-serif" w:hAnsi="Arial;Helvetica;sans-serif"/>
+          <w:b w:val="false"/>
+          <w:b w:val="false"/>
+          <w:i w:val="false"/>
+          <w:i w:val="false"/>
+          <w:caps w:val="false"/>
+          <w:smallCaps w:val="false"/>
+          <w:color w:val="222222"/>
+          <w:spacing w:val="0"/>
+          <w:sz w:val="24"/>
+        </w:rPr>
+      </w:pPr>
+      <w:r>
+        <w:rPr/>
+      </w:r>
+    </w:p>
+    <w:p>
+      <w:pPr>
+        <w:pStyle w:val="TextBody"/>
+        <w:widowControl/>
+        <w:bidi w:val="0"/>
+        <w:spacing w:before="0" w:after="0"/>
+        <w:ind w:left="0" w:right="0" w:hanging="0"/>
+        <w:jc w:val="left"/>
+        <w:rPr>
+          <w:highlight w:val="none"/>
+          <w:shd w:fill="FFA6A6" w:val="clear"/>
+        </w:rPr>
+      </w:pPr>
+      <w:r>
+        <w:rPr>
+          <w:rFonts w:ascii="Arial;Helvetica;sans-serif" w:hAnsi="Arial;Helvetica;sans-serif"/>
+          <w:b w:val="false"/>
+          <w:i w:val="false"/>
+          <w:caps w:val="false"/>
+          <w:smallCaps w:val="false"/>
+          <w:color w:val="222222"/>
+          <w:spacing w:val="0"/>
+          <w:sz w:val="24"/>
+          <w:shd w:fill="FFA6A6" w:val="clear"/>
+        </w:rPr>
+        <w:t>Make 4+1 a footnote.</w:t>
+      </w:r>
+    </w:p>
+    <w:p>
+      <w:pPr>
+        <w:pStyle w:val="TextBody"/>
+        <w:widowControl/>
+        <w:bidi w:val="0"/>
+        <w:spacing w:before="0" w:after="0"/>
+        <w:ind w:left="0" w:right="0" w:hanging="0"/>
+        <w:jc w:val="left"/>
+        <w:rPr>
+          <w:rFonts w:ascii="Arial;Helvetica;sans-serif" w:hAnsi="Arial;Helvetica;sans-serif"/>
+          <w:b w:val="false"/>
+          <w:b w:val="false"/>
+          <w:i w:val="false"/>
+          <w:i w:val="false"/>
+          <w:caps w:val="false"/>
+          <w:smallCaps w:val="false"/>
+          <w:color w:val="222222"/>
+          <w:spacing w:val="0"/>
+          <w:sz w:val="24"/>
+        </w:rPr>
+      </w:pPr>
+      <w:r>
+        <w:rPr>
+          <w:shd w:fill="FFA6A6" w:val="clear"/>
+        </w:rPr>
+      </w:r>
+    </w:p>
+    <w:p>
+      <w:pPr>
+        <w:pStyle w:val="TextBody"/>
+        <w:widowControl/>
+        <w:bidi w:val="0"/>
+        <w:spacing w:before="0" w:after="0"/>
+        <w:ind w:left="0" w:right="0" w:hanging="0"/>
+        <w:jc w:val="left"/>
+        <w:rPr>
+          <w:highlight w:val="none"/>
+          <w:shd w:fill="FFA6A6" w:val="clear"/>
+        </w:rPr>
+      </w:pPr>
+      <w:r>
+        <w:rPr>
+          <w:rFonts w:ascii="Arial;Helvetica;sans-serif" w:hAnsi="Arial;Helvetica;sans-serif"/>
+          <w:b w:val="false"/>
+          <w:i w:val="false"/>
+          <w:caps w:val="false"/>
+          <w:smallCaps w:val="false"/>
+          <w:color w:val="222222"/>
+          <w:spacing w:val="0"/>
+          <w:sz w:val="24"/>
+          <w:shd w:fill="FFA6A6" w:val="clear"/>
+        </w:rPr>
+        <w:t>Change SCS to system</w:t>
+      </w:r>
+    </w:p>
+    <w:p>
+      <w:pPr>
         <w:pStyle w:val="Normal"/>
         <w:bidi w:val="0"/>
         <w:jc w:val="left"/>
@@ -3584,6 +3738,23 @@
       </w:pPr>
       <w:r>
         <w:rPr/>
+      </w:r>
+    </w:p>
+    <w:p>
+      <w:pPr>
+        <w:pStyle w:val="Normal"/>
+        <w:bidi w:val="0"/>
+        <w:jc w:val="left"/>
+        <w:rPr>
+          <w:highlight w:val="none"/>
+          <w:shd w:fill="FFA6A6" w:val="clear"/>
+        </w:rPr>
+      </w:pPr>
+      <w:r>
+        <w:rPr>
+          <w:shd w:fill="FFA6A6" w:val="clear"/>
+        </w:rPr>
+        <w:t>Linking principles and objectives to part 1. Becomes “Objectives” and rewrite to bring out objectives.</w:t>
       </w:r>
     </w:p>
     <w:sectPr>

</xml_diff>

<commit_message>
Build with no changes, to create missing PDF outputs.
</commit_message>
<xml_diff>
--- a/Actions 2025-07-02.docx
+++ b/Actions 2025-07-02.docx
@@ -364,6 +364,34 @@
         </w:rPr>
         <w:t>Move to part 2.</w:t>
       </w:r>
+      <w:r>
+        <w:rPr>
+          <w:rFonts w:ascii="Arial;Helvetica;sans-serif" w:hAnsi="Arial;Helvetica;sans-serif"/>
+          <w:b w:val="false"/>
+          <w:i w:val="false"/>
+          <w:caps w:val="false"/>
+          <w:smallCaps w:val="false"/>
+          <w:color w:val="222222"/>
+          <w:spacing w:val="0"/>
+          <w:sz w:val="24"/>
+          <w:shd w:fill="FFA6A6" w:val="clear"/>
+        </w:rPr>
+        <w:t xml:space="preserve"> </w:t>
+      </w:r>
+      <w:r>
+        <w:rPr>
+          <w:rFonts w:ascii="Arial;Helvetica;sans-serif" w:hAnsi="Arial;Helvetica;sans-serif"/>
+          <w:b w:val="false"/>
+          <w:i w:val="false"/>
+          <w:caps w:val="false"/>
+          <w:smallCaps w:val="false"/>
+          <w:color w:val="222222"/>
+          <w:spacing w:val="0"/>
+          <w:sz w:val="24"/>
+          <w:shd w:fill="FFA6A6" w:val="clear"/>
+        </w:rPr>
+        <w:t>Done.</w:t>
+      </w:r>
     </w:p>
     <w:p>
       <w:pPr>
@@ -578,63 +606,7 @@
           <w:sz w:val="24"/>
           <w:shd w:fill="FFFF00" w:val="clear"/>
         </w:rPr>
-        <w:t xml:space="preserve">Make Part 1 normative, 2 </w:t>
-      </w:r>
-      <w:r>
-        <w:rPr>
-          <w:rFonts w:ascii="Arial;Helvetica;sans-serif" w:hAnsi="Arial;Helvetica;sans-serif"/>
-          <w:b w:val="false"/>
-          <w:i w:val="false"/>
-          <w:caps w:val="false"/>
-          <w:smallCaps w:val="false"/>
-          <w:color w:val="222222"/>
-          <w:spacing w:val="0"/>
-          <w:sz w:val="24"/>
-          <w:shd w:fill="FFFF00" w:val="clear"/>
-        </w:rPr>
-        <w:t>informative</w:t>
-      </w:r>
-      <w:r>
-        <w:rPr>
-          <w:rFonts w:ascii="Arial;Helvetica;sans-serif" w:hAnsi="Arial;Helvetica;sans-serif"/>
-          <w:b w:val="false"/>
-          <w:i w:val="false"/>
-          <w:caps w:val="false"/>
-          <w:smallCaps w:val="false"/>
-          <w:color w:val="222222"/>
-          <w:spacing w:val="0"/>
-          <w:sz w:val="24"/>
-          <w:shd w:fill="FFFF00" w:val="clear"/>
-        </w:rPr>
-        <w:t xml:space="preserve">, 3 </w:t>
-      </w:r>
-      <w:r>
-        <w:rPr>
-          <w:rFonts w:ascii="Arial;Helvetica;sans-serif" w:hAnsi="Arial;Helvetica;sans-serif"/>
-          <w:b w:val="false"/>
-          <w:i w:val="false"/>
-          <w:caps w:val="false"/>
-          <w:smallCaps w:val="false"/>
-          <w:color w:val="222222"/>
-          <w:spacing w:val="0"/>
-          <w:sz w:val="24"/>
-          <w:shd w:fill="FFFF00" w:val="clear"/>
-        </w:rPr>
-        <w:t>discursive</w:t>
-      </w:r>
-      <w:r>
-        <w:rPr>
-          <w:rFonts w:ascii="Arial;Helvetica;sans-serif" w:hAnsi="Arial;Helvetica;sans-serif"/>
-          <w:b w:val="false"/>
-          <w:i w:val="false"/>
-          <w:caps w:val="false"/>
-          <w:smallCaps w:val="false"/>
-          <w:color w:val="222222"/>
-          <w:spacing w:val="0"/>
-          <w:sz w:val="24"/>
-          <w:shd w:fill="FFFF00" w:val="clear"/>
-        </w:rPr>
-        <w:t>. Come back to this point after reorganisation of parts.</w:t>
+        <w:t>Make Part 1 normative, 2 informative, 3 discursive. Come back to this point after reorganisation of parts.</w:t>
       </w:r>
     </w:p>
     <w:p>
@@ -2173,35 +2145,7 @@
           <w:sz w:val="24"/>
           <w:shd w:fill="FFFF00" w:val="clear"/>
         </w:rPr>
-        <w:t>Can leave table but label as “example only”. Change text to make it clear that this is an illustration only an</w:t>
-      </w:r>
-      <w:r>
-        <w:rPr>
-          <w:rFonts w:ascii="Arial;Helvetica;sans-serif" w:hAnsi="Arial;Helvetica;sans-serif"/>
-          <w:b w:val="false"/>
-          <w:i w:val="false"/>
-          <w:caps w:val="false"/>
-          <w:smallCaps w:val="false"/>
-          <w:color w:val="222222"/>
-          <w:spacing w:val="0"/>
-          <w:sz w:val="24"/>
-          <w:shd w:fill="FFFF00" w:val="clear"/>
-        </w:rPr>
-        <w:t>d</w:t>
-      </w:r>
-      <w:r>
-        <w:rPr>
-          <w:rFonts w:ascii="Arial;Helvetica;sans-serif" w:hAnsi="Arial;Helvetica;sans-serif"/>
-          <w:b w:val="false"/>
-          <w:i w:val="false"/>
-          <w:caps w:val="false"/>
-          <w:smallCaps w:val="false"/>
-          <w:color w:val="222222"/>
-          <w:spacing w:val="0"/>
-          <w:sz w:val="24"/>
-          <w:shd w:fill="FFFF00" w:val="clear"/>
-        </w:rPr>
-        <w:t xml:space="preserve"> that the actual descriptions of likelihoods and severities and their allocations to DSALs will vary between industries and applications and will be discussed further in Part 2 (tailoring?).</w:t>
+        <w:t>Can leave table but label as “example only”. Change text to make it clear that this is an illustration only and that the actual descriptions of likelihoods and severities and their allocations to DSALs will vary between industries and applications and will be discussed further in Part 2 (tailoring?).</w:t>
       </w:r>
     </w:p>
     <w:p>
@@ -2553,7 +2497,17 @@
         </w:rPr>
       </w:pPr>
       <w:r>
-        <w:rPr/>
+        <w:rPr>
+          <w:rFonts w:ascii="Arial;Helvetica;sans-serif" w:hAnsi="Arial;Helvetica;sans-serif"/>
+          <w:b w:val="false"/>
+          <w:i w:val="false"/>
+          <w:caps w:val="false"/>
+          <w:smallCaps w:val="false"/>
+          <w:color w:val="222222"/>
+          <w:spacing w:val="0"/>
+          <w:sz w:val="24"/>
+          <w:shd w:fill="FFFF00" w:val="clear"/>
+        </w:rPr>
       </w:r>
     </w:p>
     <w:p>
@@ -3643,7 +3597,16 @@
         </w:rPr>
       </w:pPr>
       <w:r>
-        <w:rPr/>
+        <w:rPr>
+          <w:rFonts w:ascii="Arial;Helvetica;sans-serif" w:hAnsi="Arial;Helvetica;sans-serif"/>
+          <w:b w:val="false"/>
+          <w:i w:val="false"/>
+          <w:caps w:val="false"/>
+          <w:smallCaps w:val="false"/>
+          <w:color w:val="222222"/>
+          <w:spacing w:val="0"/>
+          <w:sz w:val="24"/>
+        </w:rPr>
       </w:r>
     </w:p>
     <w:p>
@@ -3697,7 +3660,14 @@
       </w:pPr>
       <w:r>
         <w:rPr>
-          <w:shd w:fill="FFA6A6" w:val="clear"/>
+          <w:rFonts w:ascii="Arial;Helvetica;sans-serif" w:hAnsi="Arial;Helvetica;sans-serif"/>
+          <w:b w:val="false"/>
+          <w:i w:val="false"/>
+          <w:caps w:val="false"/>
+          <w:smallCaps w:val="false"/>
+          <w:color w:val="222222"/>
+          <w:spacing w:val="0"/>
+          <w:sz w:val="24"/>
         </w:rPr>
       </w:r>
     </w:p>

</xml_diff>